<commit_message>
Añade el logo a la contraportada de la plantilla de Word
Co-Authored-By: Claude Opus 5.5 <noreply@anthropic.com>
Claude-Session: https://claude.ai/code/session_01VgtpFgEc7N9EFi63NUqpEw
</commit_message>
<xml_diff>
--- a/plantillas/word/Paginas_tipo_Santiago_Ways.docx
+++ b/plantillas/word/Paginas_tipo_Santiago_Ways.docx
@@ -11695,7 +11695,52 @@
     </w:p>
     <w:p>
       <w:pPr>
-        <w:spacing w:after="5700" w:before="0" w:line="240" w:lineRule="auto"/>
+        <w:spacing w:after="0"/>
+      </w:pPr>
+      <w:r>
+        <w:drawing>
+          <wp:inline distT="0" distB="0" distL="0" distR="0">
+            <wp:extent cx="1905000" cy="304800"/>
+            <wp:effectExtent t="0" r="0" b="0" l="0"/>
+            <wp:docPr id="6" name=""/>
+            <wp:cNvGraphicFramePr>
+              <a:graphicFrameLocks xmlns:a="http://schemas.openxmlformats.org/drawingml/2006/main" noChangeAspect="1"/>
+            </wp:cNvGraphicFramePr>
+            <a:graphic xmlns:a="http://schemas.openxmlformats.org/drawingml/2006/main">
+              <a:graphicData uri="http://schemas.openxmlformats.org/drawingml/2006/picture">
+                <pic:pic xmlns:pic="http://schemas.openxmlformats.org/drawingml/2006/picture">
+                  <pic:nvPicPr>
+                    <pic:cNvPr id="0" name="" descr=""/>
+                    <pic:cNvPicPr>
+                      <a:picLocks noChangeAspect="1" noChangeArrowheads="1"/>
+                    </pic:cNvPicPr>
+                  </pic:nvPicPr>
+                  <pic:blipFill>
+                    <a:blip r:embed="rId19" cstate="none"/>
+                    <a:srcRect/>
+                    <a:stretch>
+                      <a:fillRect/>
+                    </a:stretch>
+                  </pic:blipFill>
+                  <pic:spPr bwMode="auto">
+                    <a:xfrm>
+                      <a:off x="0" y="0"/>
+                      <a:ext cx="1905000" cy="304800"/>
+                    </a:xfrm>
+                    <a:prstGeom prst="rect">
+                      <a:avLst/>
+                    </a:prstGeom>
+                  </pic:spPr>
+                </pic:pic>
+              </a:graphicData>
+            </a:graphic>
+          </wp:inline>
+        </w:drawing>
+      </w:r>
+    </w:p>
+    <w:p>
+      <w:pPr>
+        <w:spacing w:after="0" w:before="4300" w:line="240" w:lineRule="auto"/>
       </w:pPr>
       <w:r>
         <w:rPr>
@@ -12437,60 +12482,10 @@
   </w:tbl>
   <w:p>
     <w:pPr>
-      <w:tabs>
-        <w:tab w:val="right" w:pos="9070"/>
-      </w:tabs>
-      <w:spacing w:after="0" w:before="520"/>
+      <w:pStyle w:val="Legal"/>
+      <w:spacing w:after="0" w:before="360"/>
     </w:pPr>
     <w:r>
-      <w:drawing>
-        <wp:inline distT="0" distB="0" distL="0" distR="0">
-          <wp:extent cx="1428750" cy="228600"/>
-          <wp:effectExtent t="0" r="0" b="0" l="0"/>
-          <wp:docPr id="7" name=""/>
-          <wp:cNvGraphicFramePr>
-            <a:graphicFrameLocks xmlns:a="http://schemas.openxmlformats.org/drawingml/2006/main" noChangeAspect="1"/>
-          </wp:cNvGraphicFramePr>
-          <a:graphic xmlns:a="http://schemas.openxmlformats.org/drawingml/2006/main">
-            <a:graphicData uri="http://schemas.openxmlformats.org/drawingml/2006/picture">
-              <pic:pic xmlns:pic="http://schemas.openxmlformats.org/drawingml/2006/picture">
-                <pic:nvPicPr>
-                  <pic:cNvPr id="0" name="" descr=""/>
-                  <pic:cNvPicPr>
-                    <a:picLocks noChangeAspect="1" noChangeArrowheads="1"/>
-                  </pic:cNvPicPr>
-                </pic:nvPicPr>
-                <pic:blipFill>
-                  <a:blip r:embed="rId0" cstate="none"/>
-                  <a:srcRect/>
-                  <a:stretch>
-                    <a:fillRect/>
-                  </a:stretch>
-                </pic:blipFill>
-                <pic:spPr bwMode="auto">
-                  <a:xfrm>
-                    <a:off x="0" y="0"/>
-                    <a:ext cx="1428750" cy="228600"/>
-                  </a:xfrm>
-                  <a:prstGeom prst="rect">
-                    <a:avLst/>
-                  </a:prstGeom>
-                </pic:spPr>
-              </pic:pic>
-            </a:graphicData>
-          </a:graphic>
-        </wp:inline>
-      </w:drawing>
-    </w:r>
-    <w:r>
-      <w:t xml:space="preserve">	</w:t>
-    </w:r>
-    <w:r>
-      <w:rPr>
-        <w:color w:val="6F6F6E"/>
-        <w:sz w:val="14"/>
-        <w:szCs w:val="14"/>
-      </w:rPr>
       <w:t xml:space="preserve">© 2027 Santiago Ways. Todos los derechos reservados.</w:t>
     </w:r>
   </w:p>
@@ -12571,7 +12566,7 @@
         <wp:inline distT="0" distB="0" distL="0" distR="0">
           <wp:extent cx="1047750" cy="171450"/>
           <wp:effectExtent t="0" r="0" b="0" l="0"/>
-          <wp:docPr id="6" name=""/>
+          <wp:docPr id="7" name=""/>
           <wp:cNvGraphicFramePr>
             <a:graphicFrameLocks xmlns:a="http://schemas.openxmlformats.org/drawingml/2006/main" noChangeAspect="1"/>
           </wp:cNvGraphicFramePr>
@@ -12648,7 +12643,7 @@
         <wp:inline distT="0" distB="0" distL="0" distR="0">
           <wp:extent cx="1047750" cy="171450"/>
           <wp:effectExtent t="0" r="0" b="0" l="0"/>
-          <wp:docPr id="6" name=""/>
+          <wp:docPr id="7" name=""/>
           <wp:cNvGraphicFramePr>
             <a:graphicFrameLocks xmlns:a="http://schemas.openxmlformats.org/drawingml/2006/main" noChangeAspect="1"/>
           </wp:cNvGraphicFramePr>

</xml_diff>